<commit_message>
update review user 1.0
</commit_message>
<xml_diff>
--- a/docs/PRD_KLH_BPLH_rev3.docx
+++ b/docs/PRD_KLH_BPLH_rev3.docx
@@ -144,7 +144,7 @@
           <w:color w:val="51625E"/>
           <w:sz w:val="17"/>
         </w:rPr>
-        <w:t>Versi 1.1 · 21 Juli 2026 · Dokumen pegangan kerja bersama (Desainer · PM · Klien)</w:t>
+        <w:t xml:space="preserve">Versi 1.1 · 21 Juli 2026 · Dokumen pegangan kerja bersama </w:t>
       </w:r>
     </w:p>
     <w:p>
@@ -175,6 +175,7 @@
           <w:tab w:val="right" w:leader="dot" w:pos="9508"/>
         </w:tabs>
         <w:rPr>
+          <w:rFonts w:hint="eastAsia"/>
           <w:noProof/>
         </w:rPr>
       </w:pPr>
@@ -253,6 +254,7 @@
           <w:tab w:val="right" w:leader="dot" w:pos="9508"/>
         </w:tabs>
         <w:rPr>
+          <w:rFonts w:hint="eastAsia"/>
           <w:noProof/>
         </w:rPr>
       </w:pPr>
@@ -322,6 +324,7 @@
           <w:tab w:val="right" w:leader="dot" w:pos="9508"/>
         </w:tabs>
         <w:rPr>
+          <w:rFonts w:hint="eastAsia"/>
           <w:noProof/>
         </w:rPr>
       </w:pPr>
@@ -391,6 +394,7 @@
           <w:tab w:val="right" w:leader="dot" w:pos="9508"/>
         </w:tabs>
         <w:rPr>
+          <w:rFonts w:hint="eastAsia"/>
           <w:noProof/>
         </w:rPr>
       </w:pPr>
@@ -460,6 +464,7 @@
           <w:tab w:val="right" w:leader="dot" w:pos="9508"/>
         </w:tabs>
         <w:rPr>
+          <w:rFonts w:hint="eastAsia"/>
           <w:noProof/>
         </w:rPr>
       </w:pPr>
@@ -469,7 +474,21 @@
             <w:rStyle w:val="Hyperlink"/>
             <w:noProof/>
           </w:rPr>
-          <w:t>4. Metodologi &amp; Tahapan Kerja UI/UX</w:t>
+          <w:t>4. Metodologi &amp; T</w:t>
+        </w:r>
+        <w:r>
+          <w:rPr>
+            <w:rStyle w:val="Hyperlink"/>
+            <w:noProof/>
+          </w:rPr>
+          <w:t>a</w:t>
+        </w:r>
+        <w:r>
+          <w:rPr>
+            <w:rStyle w:val="Hyperlink"/>
+            <w:noProof/>
+          </w:rPr>
+          <w:t>hapan Kerja UI/UX</w:t>
         </w:r>
         <w:r>
           <w:rPr>
@@ -529,6 +548,7 @@
           <w:tab w:val="right" w:leader="dot" w:pos="9508"/>
         </w:tabs>
         <w:rPr>
+          <w:rFonts w:hint="eastAsia"/>
           <w:noProof/>
         </w:rPr>
       </w:pPr>
@@ -598,6 +618,7 @@
           <w:tab w:val="right" w:leader="dot" w:pos="9508"/>
         </w:tabs>
         <w:rPr>
+          <w:rFonts w:hint="eastAsia"/>
           <w:noProof/>
         </w:rPr>
       </w:pPr>
@@ -667,6 +688,7 @@
           <w:tab w:val="right" w:leader="dot" w:pos="9508"/>
         </w:tabs>
         <w:rPr>
+          <w:rFonts w:hint="eastAsia"/>
           <w:noProof/>
         </w:rPr>
       </w:pPr>
@@ -736,6 +758,7 @@
           <w:tab w:val="right" w:leader="dot" w:pos="9508"/>
         </w:tabs>
         <w:rPr>
+          <w:rFonts w:hint="eastAsia"/>
           <w:noProof/>
         </w:rPr>
       </w:pPr>
@@ -805,6 +828,7 @@
           <w:tab w:val="right" w:leader="dot" w:pos="9508"/>
         </w:tabs>
         <w:rPr>
+          <w:rFonts w:hint="eastAsia"/>
           <w:noProof/>
         </w:rPr>
       </w:pPr>
@@ -874,6 +898,7 @@
           <w:tab w:val="right" w:leader="dot" w:pos="9508"/>
         </w:tabs>
         <w:rPr>
+          <w:rFonts w:hint="eastAsia"/>
           <w:noProof/>
         </w:rPr>
       </w:pPr>
@@ -943,6 +968,7 @@
           <w:tab w:val="right" w:leader="dot" w:pos="9508"/>
         </w:tabs>
         <w:rPr>
+          <w:rFonts w:hint="eastAsia"/>
           <w:noProof/>
         </w:rPr>
       </w:pPr>
@@ -1012,6 +1038,7 @@
           <w:tab w:val="right" w:leader="dot" w:pos="9508"/>
         </w:tabs>
         <w:rPr>
+          <w:rFonts w:hint="eastAsia"/>
           <w:noProof/>
         </w:rPr>
       </w:pPr>
@@ -1081,6 +1108,7 @@
           <w:tab w:val="right" w:leader="dot" w:pos="9508"/>
         </w:tabs>
         <w:rPr>
+          <w:rFonts w:hint="eastAsia"/>
           <w:noProof/>
         </w:rPr>
       </w:pPr>
@@ -1150,6 +1178,7 @@
           <w:tab w:val="right" w:leader="dot" w:pos="9508"/>
         </w:tabs>
         <w:rPr>
+          <w:rFonts w:hint="eastAsia"/>
           <w:noProof/>
         </w:rPr>
       </w:pPr>
@@ -1219,6 +1248,7 @@
           <w:tab w:val="right" w:leader="dot" w:pos="9508"/>
         </w:tabs>
         <w:rPr>
+          <w:rFonts w:hint="eastAsia"/>
           <w:noProof/>
         </w:rPr>
       </w:pPr>
@@ -1288,6 +1318,7 @@
           <w:tab w:val="right" w:leader="dot" w:pos="9508"/>
         </w:tabs>
         <w:rPr>
+          <w:rFonts w:hint="eastAsia"/>
           <w:noProof/>
         </w:rPr>
       </w:pPr>
@@ -1357,6 +1388,7 @@
           <w:tab w:val="right" w:leader="dot" w:pos="9508"/>
         </w:tabs>
         <w:rPr>
+          <w:rFonts w:hint="eastAsia"/>
           <w:noProof/>
         </w:rPr>
       </w:pPr>
@@ -1426,6 +1458,7 @@
           <w:tab w:val="right" w:leader="dot" w:pos="9508"/>
         </w:tabs>
         <w:rPr>
+          <w:rFonts w:hint="eastAsia"/>
           <w:noProof/>
         </w:rPr>
       </w:pPr>
@@ -1495,6 +1528,7 @@
           <w:tab w:val="right" w:leader="dot" w:pos="9508"/>
         </w:tabs>
         <w:rPr>
+          <w:rFonts w:hint="eastAsia"/>
           <w:noProof/>
         </w:rPr>
       </w:pPr>
@@ -1564,6 +1598,7 @@
           <w:tab w:val="right" w:leader="dot" w:pos="9508"/>
         </w:tabs>
         <w:rPr>
+          <w:rFonts w:hint="eastAsia"/>
           <w:noProof/>
         </w:rPr>
       </w:pPr>
@@ -1633,6 +1668,7 @@
           <w:tab w:val="right" w:leader="dot" w:pos="9508"/>
         </w:tabs>
         <w:rPr>
+          <w:rFonts w:hint="eastAsia"/>
           <w:noProof/>
         </w:rPr>
       </w:pPr>
@@ -1702,6 +1738,7 @@
           <w:tab w:val="right" w:leader="dot" w:pos="9508"/>
         </w:tabs>
         <w:rPr>
+          <w:rFonts w:hint="eastAsia"/>
           <w:noProof/>
         </w:rPr>
       </w:pPr>
@@ -1771,6 +1808,7 @@
           <w:tab w:val="right" w:leader="dot" w:pos="9508"/>
         </w:tabs>
         <w:rPr>
+          <w:rFonts w:hint="eastAsia"/>
           <w:noProof/>
         </w:rPr>
       </w:pPr>
@@ -1840,6 +1878,7 @@
           <w:tab w:val="right" w:leader="dot" w:pos="9508"/>
         </w:tabs>
         <w:rPr>
+          <w:rFonts w:hint="eastAsia"/>
           <w:noProof/>
         </w:rPr>
       </w:pPr>
@@ -1909,6 +1948,7 @@
           <w:tab w:val="right" w:leader="dot" w:pos="9508"/>
         </w:tabs>
         <w:rPr>
+          <w:rFonts w:hint="eastAsia"/>
           <w:noProof/>
         </w:rPr>
       </w:pPr>
@@ -1978,6 +2018,7 @@
           <w:tab w:val="right" w:leader="dot" w:pos="9508"/>
         </w:tabs>
         <w:rPr>
+          <w:rFonts w:hint="eastAsia"/>
           <w:noProof/>
         </w:rPr>
       </w:pPr>
@@ -2047,6 +2088,7 @@
           <w:tab w:val="right" w:leader="dot" w:pos="9508"/>
         </w:tabs>
         <w:rPr>
+          <w:rFonts w:hint="eastAsia"/>
           <w:noProof/>
         </w:rPr>
       </w:pPr>
@@ -2116,6 +2158,7 @@
           <w:tab w:val="right" w:leader="dot" w:pos="9508"/>
         </w:tabs>
         <w:rPr>
+          <w:rFonts w:hint="eastAsia"/>
           <w:noProof/>
         </w:rPr>
       </w:pPr>
@@ -2185,6 +2228,7 @@
           <w:tab w:val="right" w:leader="dot" w:pos="9508"/>
         </w:tabs>
         <w:rPr>
+          <w:rFonts w:hint="eastAsia"/>
           <w:noProof/>
         </w:rPr>
       </w:pPr>
@@ -2254,6 +2298,7 @@
           <w:tab w:val="right" w:leader="dot" w:pos="9508"/>
         </w:tabs>
         <w:rPr>
+          <w:rFonts w:hint="eastAsia"/>
           <w:noProof/>
         </w:rPr>
       </w:pPr>
@@ -3617,11 +3662,11 @@
         <w:tblLook w:val="04A0" w:firstRow="1" w:lastRow="0" w:firstColumn="1" w:lastColumn="0" w:noHBand="0" w:noVBand="1"/>
       </w:tblPr>
       <w:tblGrid>
-        <w:gridCol w:w="2445"/>
-        <w:gridCol w:w="1947"/>
-        <w:gridCol w:w="1537"/>
-        <w:gridCol w:w="1660"/>
-        <w:gridCol w:w="2145"/>
+        <w:gridCol w:w="2372"/>
+        <w:gridCol w:w="1905"/>
+        <w:gridCol w:w="1515"/>
+        <w:gridCol w:w="1642"/>
+        <w:gridCol w:w="2074"/>
       </w:tblGrid>
       <w:tr>
         <w:trPr>
@@ -3988,7 +4033,19 @@
               <w:rPr>
                 <w:sz w:val="19"/>
               </w:rPr>
-              <w:t>— (belum ada)</w:t>
+              <w:t>klh-ppid-</w:t>
+            </w:r>
+            <w:r>
+              <w:rPr>
+                <w:sz w:val="19"/>
+              </w:rPr>
+              <w:t>mobile</w:t>
+            </w:r>
+            <w:r>
+              <w:rPr>
+                <w:sz w:val="19"/>
+              </w:rPr>
+              <w:t>/</w:t>
             </w:r>
           </w:p>
         </w:tc>
@@ -4043,10 +4100,24 @@
             </w:pPr>
             <w:r>
               <w:rPr>
-                <w:color w:val="C03A2B"/>
-                <w:sz w:val="19"/>
-              </w:rPr>
-              <w:t>Keluaran KAK #2 — BELUM DIBANGUN</w:t>
+                <w:color w:val="0E7A4E"/>
+                <w:sz w:val="19"/>
+              </w:rPr>
+              <w:t>Keluaran KAK #2 (</w:t>
+            </w:r>
+            <w:r>
+              <w:rPr>
+                <w:color w:val="0E7A4E"/>
+                <w:sz w:val="19"/>
+              </w:rPr>
+              <w:t>mobile</w:t>
+            </w:r>
+            <w:r>
+              <w:rPr>
+                <w:color w:val="0E7A4E"/>
+                <w:sz w:val="19"/>
+              </w:rPr>
+              <w:t>)</w:t>
             </w:r>
           </w:p>
         </w:tc>
@@ -10936,8 +11007,8 @@
         <w:tblLook w:val="04A0" w:firstRow="1" w:lastRow="0" w:firstColumn="1" w:lastColumn="0" w:noHBand="0" w:noVBand="1"/>
       </w:tblPr>
       <w:tblGrid>
-        <w:gridCol w:w="2382"/>
-        <w:gridCol w:w="4559"/>
+        <w:gridCol w:w="2314"/>
+        <w:gridCol w:w="4401"/>
         <w:gridCol w:w="2793"/>
       </w:tblGrid>
       <w:tr>

</xml_diff>